<commit_message>
test(documents): refresh golden DOCX fixtures after template update
Regenerate and sync approved DOCX fixtures from manual review outputs so golden tests validate the updated template rendering, including the adjusted signature section.
</commit_message>
<xml_diff>
--- a/backend/src/test/resources/golden-docs/contract_application_sample.docx
+++ b/backend/src/test/resources/golden-docs/contract_application_sample.docx
@@ -40,9 +40,7 @@
                 <w:tab w:val="left" w:pos="0" w:leader="none"/>
               </w:tabs>
               <w:spacing w:before="0" w:after="0"/>
-              <w:rPr>
-                <w:rFonts w:ascii="Liberation Sans" w:hAnsi="Liberation Sans"/>
-              </w:rPr>
+              <w:rPr/>
             </w:pPr>
             <w:r>
               <w:t>ДОГОВОР-ЗАЯВКА № 2026-05-15</w:t>
@@ -57,9 +55,7 @@
                 <w:tab w:val="left" w:pos="0" w:leader="none"/>
               </w:tabs>
               <w:spacing w:before="0" w:after="0"/>
-              <w:rPr>
-                <w:rFonts w:ascii="Liberation Sans" w:hAnsi="Liberation Sans"/>
-              </w:rPr>
+              <w:rPr/>
             </w:pPr>
             <w:r>
               <w:rPr>
@@ -80,9 +76,7 @@
                 <w:tab w:val="left" w:pos="0" w:leader="none"/>
               </w:tabs>
               <w:spacing w:before="0" w:after="0"/>
-              <w:rPr>
-                <w:rFonts w:ascii="Liberation Sans" w:hAnsi="Liberation Sans"/>
-              </w:rPr>
+              <w:rPr/>
             </w:pPr>
             <w:r>
               <w:t>от 15 мая 2026г.</w:t>
@@ -169,9 +163,7 @@
               <w:pStyle w:val="Normal"/>
               <w:widowControl w:val="false"/>
               <w:spacing w:before="0" w:after="0"/>
-              <w:rPr>
-                <w:rFonts w:ascii="Liberation Sans" w:hAnsi="Liberation Sans"/>
-              </w:rPr>
+              <w:rPr/>
             </w:pPr>
             <w:r>
               <w:rPr>
@@ -200,9 +192,7 @@
               <w:widowControl w:val="false"/>
               <w:spacing w:before="0" w:after="200"/>
               <w:jc w:val="center"/>
-              <w:rPr>
-                <w:rFonts w:ascii="Liberation Sans" w:hAnsi="Liberation Sans"/>
-              </w:rPr>
+              <w:rPr/>
             </w:pPr>
             <w:r>
               <w:t>ООО Ромашка</w:t>
@@ -246,9 +236,7 @@
               <w:pStyle w:val="Normal"/>
               <w:widowControl w:val="false"/>
               <w:spacing w:before="0" w:after="0"/>
-              <w:rPr>
-                <w:rFonts w:ascii="Liberation Sans" w:hAnsi="Liberation Sans"/>
-              </w:rPr>
+              <w:rPr/>
             </w:pPr>
             <w:r>
               <w:rPr>
@@ -278,9 +266,7 @@
               <w:snapToGrid w:val="false"/>
               <w:spacing w:lineRule="auto" w:line="240" w:before="0" w:after="200"/>
               <w:jc w:val="both"/>
-              <w:rPr>
-                <w:rFonts w:ascii="Liberation Sans" w:hAnsi="Liberation Sans"/>
-              </w:rPr>
+              <w:rPr/>
             </w:pPr>
             <w:r>
               <w:t>+7 812 000 00 00</w:t>
@@ -328,9 +314,7 @@
               <w:pStyle w:val="Normal"/>
               <w:widowControl w:val="false"/>
               <w:spacing w:before="0" w:after="0"/>
-              <w:rPr>
-                <w:rFonts w:ascii="Liberation Sans" w:hAnsi="Liberation Sans"/>
-              </w:rPr>
+              <w:rPr/>
             </w:pPr>
             <w:r>
               <w:rPr>
@@ -359,9 +343,7 @@
               <w:pStyle w:val="Normal"/>
               <w:widowControl w:val="false"/>
               <w:spacing w:before="0" w:after="0"/>
-              <w:rPr>
-                <w:rFonts w:ascii="Liberation Sans" w:hAnsi="Liberation Sans"/>
-              </w:rPr>
+              <w:rPr/>
             </w:pPr>
             <w:r>
               <w:t>Москва</w:t>
@@ -372,9 +354,7 @@
               <w:pStyle w:val="Normal"/>
               <w:widowControl w:val="false"/>
               <w:spacing w:before="0" w:after="0"/>
-              <w:rPr>
-                <w:rFonts w:ascii="Liberation Sans" w:hAnsi="Liberation Sans"/>
-              </w:rPr>
+              <w:rPr/>
             </w:pPr>
             <w:r>
               <w:t>Контакт Погрузки +7 900 123 45 67</w:t>
@@ -421,9 +401,7 @@
               <w:pStyle w:val="Normal"/>
               <w:widowControl w:val="false"/>
               <w:spacing w:before="0" w:after="0"/>
-              <w:rPr>
-                <w:rFonts w:ascii="Liberation Sans" w:hAnsi="Liberation Sans"/>
-              </w:rPr>
+              <w:rPr/>
             </w:pPr>
             <w:r>
               <w:rPr>
@@ -452,9 +430,7 @@
               <w:pStyle w:val="Normal"/>
               <w:widowControl w:val="false"/>
               <w:spacing w:before="0" w:after="0"/>
-              <w:rPr>
-                <w:rFonts w:ascii="Liberation Sans" w:hAnsi="Liberation Sans"/>
-              </w:rPr>
+              <w:rPr/>
             </w:pPr>
             <w:r>
               <w:t>Санкт-Петербург</w:t>
@@ -465,9 +441,7 @@
               <w:pStyle w:val="Normal"/>
               <w:widowControl w:val="false"/>
               <w:spacing w:before="0" w:after="0"/>
-              <w:rPr>
-                <w:rFonts w:ascii="Liberation Sans" w:hAnsi="Liberation Sans"/>
-              </w:rPr>
+              <w:rPr/>
             </w:pPr>
             <w:r>
               <w:t>Контакт Разгрузки +7 900 765 43 21</w:t>
@@ -516,9 +490,7 @@
               <w:pStyle w:val="Normal"/>
               <w:widowControl w:val="false"/>
               <w:spacing w:before="0" w:after="0"/>
-              <w:rPr>
-                <w:rFonts w:ascii="Liberation Sans" w:hAnsi="Liberation Sans"/>
-              </w:rPr>
+              <w:rPr/>
             </w:pPr>
             <w:r>
               <w:rPr>
@@ -556,9 +528,7 @@
               <w:pStyle w:val="Normal"/>
               <w:widowControl w:val="false"/>
               <w:spacing w:before="0" w:after="0"/>
-              <w:rPr>
-                <w:rFonts w:ascii="Liberation Sans" w:hAnsi="Liberation Sans"/>
-              </w:rPr>
+              <w:rPr/>
             </w:pPr>
             <w:r>
               <w:t xml:space="preserve"> 1 рейс</w:t>
@@ -583,9 +553,7 @@
               <w:pStyle w:val="Normal"/>
               <w:widowControl w:val="false"/>
               <w:spacing w:before="0" w:after="0"/>
-              <w:rPr>
-                <w:rFonts w:ascii="Liberation Sans" w:hAnsi="Liberation Sans"/>
-              </w:rPr>
+              <w:rPr/>
             </w:pPr>
             <w:r>
               <w:rPr>
@@ -601,9 +569,7 @@
               <w:pStyle w:val="Normal"/>
               <w:widowControl w:val="false"/>
               <w:spacing w:before="0" w:after="0"/>
-              <w:rPr>
-                <w:rFonts w:ascii="Liberation Sans" w:hAnsi="Liberation Sans"/>
-              </w:rPr>
+              <w:rPr/>
             </w:pPr>
             <w:r>
               <w:rPr>
@@ -632,9 +598,7 @@
               <w:pStyle w:val="Normal"/>
               <w:widowControl w:val="false"/>
               <w:spacing w:before="0" w:after="0"/>
-              <w:rPr>
-                <w:rFonts w:ascii="Liberation Sans" w:hAnsi="Liberation Sans"/>
-              </w:rPr>
+              <w:rPr/>
             </w:pPr>
             <w:r>
               <w:rPr>
@@ -665,9 +629,7 @@
               <w:pStyle w:val="Normal"/>
               <w:widowControl w:val="false"/>
               <w:spacing w:before="0" w:after="0"/>
-              <w:rPr>
-                <w:rFonts w:ascii="Liberation Sans" w:hAnsi="Liberation Sans"/>
-              </w:rPr>
+              <w:rPr/>
             </w:pPr>
             <w:r>
               <w:rPr>
@@ -683,9 +645,7 @@
               <w:pStyle w:val="Normal"/>
               <w:widowControl w:val="false"/>
               <w:spacing w:before="0" w:after="0"/>
-              <w:rPr>
-                <w:rFonts w:ascii="Liberation Sans" w:hAnsi="Liberation Sans"/>
-              </w:rPr>
+              <w:rPr/>
             </w:pPr>
             <w:r>
               <w:rPr>
@@ -714,9 +674,7 @@
               <w:pStyle w:val="Normal"/>
               <w:widowControl w:val="false"/>
               <w:spacing w:before="0" w:after="0"/>
-              <w:rPr>
-                <w:rFonts w:ascii="Liberation Sans" w:hAnsi="Liberation Sans"/>
-              </w:rPr>
+              <w:rPr/>
             </w:pPr>
             <w:r>
               <w:t>98500.00 руб. БЕЗ НДС</w:t>
@@ -801,9 +759,7 @@
               <w:pStyle w:val="Normal"/>
               <w:widowControl w:val="false"/>
               <w:spacing w:before="0" w:after="0"/>
-              <w:rPr>
-                <w:rFonts w:ascii="Liberation Sans" w:hAnsi="Liberation Sans"/>
-              </w:rPr>
+              <w:rPr/>
             </w:pPr>
             <w:r>
               <w:rPr>
@@ -831,9 +787,7 @@
               <w:pStyle w:val="Normal"/>
               <w:widowControl w:val="false"/>
               <w:spacing w:before="0" w:after="0"/>
-              <w:rPr>
-                <w:rFonts w:ascii="Liberation Sans" w:hAnsi="Liberation Sans"/>
-              </w:rPr>
+              <w:rPr/>
             </w:pPr>
             <w:r>
               <w:t>Volvo FH</w:t>
@@ -879,9 +833,7 @@
               <w:pStyle w:val="Normal"/>
               <w:widowControl w:val="false"/>
               <w:spacing w:before="0" w:after="0"/>
-              <w:rPr>
-                <w:rFonts w:ascii="Liberation Sans" w:hAnsi="Liberation Sans"/>
-              </w:rPr>
+              <w:rPr/>
             </w:pPr>
             <w:r>
               <w:rPr>
@@ -910,9 +862,7 @@
               <w:pStyle w:val="Normal"/>
               <w:widowControl w:val="false"/>
               <w:spacing w:before="0" w:after="0"/>
-              <w:rPr>
-                <w:rFonts w:ascii="Liberation Sans" w:hAnsi="Liberation Sans"/>
-              </w:rPr>
+              <w:rPr/>
             </w:pPr>
             <w:r>
               <w:t>А123ВС178</w:t>
@@ -959,9 +909,7 @@
               <w:pStyle w:val="Normal"/>
               <w:widowControl w:val="false"/>
               <w:spacing w:before="0" w:after="0"/>
-              <w:rPr>
-                <w:rFonts w:ascii="Liberation Sans" w:hAnsi="Liberation Sans"/>
-              </w:rPr>
+              <w:rPr/>
             </w:pPr>
             <w:r>
               <w:rPr>
@@ -989,9 +937,7 @@
               <w:pStyle w:val="Normal"/>
               <w:widowControl w:val="false"/>
               <w:spacing w:before="0" w:after="0"/>
-              <w:rPr>
-                <w:rFonts w:ascii="Liberation Sans" w:hAnsi="Liberation Sans"/>
-              </w:rPr>
+              <w:rPr/>
             </w:pPr>
             <w:r>
               <w:t>Иванов Иван Иванович</w:t>
@@ -1035,9 +981,7 @@
               <w:pStyle w:val="Normal"/>
               <w:widowControl w:val="false"/>
               <w:spacing w:lineRule="auto" w:line="240" w:before="0" w:after="0"/>
-              <w:rPr>
-                <w:rFonts w:ascii="Liberation Sans" w:hAnsi="Liberation Sans"/>
-              </w:rPr>
+              <w:rPr/>
             </w:pPr>
             <w:r>
               <w:rPr>
@@ -1065,9 +1009,7 @@
               <w:pStyle w:val="Normal"/>
               <w:widowControl w:val="false"/>
               <w:spacing w:before="0" w:after="0"/>
-              <w:rPr>
-                <w:rFonts w:ascii="Liberation Sans" w:hAnsi="Liberation Sans"/>
-              </w:rPr>
+              <w:rPr/>
             </w:pPr>
             <w:r>
               <w:t>+7 900 222 33 44</w:t>
@@ -1100,9 +1042,7 @@
       <w:pPr>
         <w:pStyle w:val="Normal"/>
         <w:spacing w:before="0" w:after="0"/>
-        <w:rPr>
-          <w:rFonts w:ascii="Liberation Sans" w:hAnsi="Liberation Sans"/>
-        </w:rPr>
+        <w:rPr/>
       </w:pPr>
       <w:r>
         <w:rPr>
@@ -1117,9 +1057,7 @@
       <w:pPr>
         <w:pStyle w:val="Normal"/>
         <w:spacing w:before="0" w:after="0"/>
-        <w:rPr>
-          <w:rFonts w:ascii="Liberation Sans" w:hAnsi="Liberation Sans"/>
-        </w:rPr>
+        <w:rPr/>
       </w:pPr>
       <w:r>
         <w:rPr>
@@ -1134,9 +1072,7 @@
       <w:pPr>
         <w:pStyle w:val="Normal"/>
         <w:spacing w:before="0" w:after="0"/>
-        <w:rPr>
-          <w:rFonts w:ascii="Liberation Sans" w:hAnsi="Liberation Sans"/>
-        </w:rPr>
+        <w:rPr/>
       </w:pPr>
       <w:r>
         <w:rPr>
@@ -1151,9 +1087,7 @@
       <w:pPr>
         <w:pStyle w:val="Normal"/>
         <w:spacing w:before="0" w:after="0"/>
-        <w:rPr>
-          <w:rFonts w:ascii="Liberation Sans" w:hAnsi="Liberation Sans"/>
-        </w:rPr>
+        <w:rPr/>
       </w:pPr>
       <w:r>
         <w:rPr>
@@ -1168,9 +1102,7 @@
       <w:pPr>
         <w:pStyle w:val="Normal"/>
         <w:spacing w:before="0" w:after="0"/>
-        <w:rPr>
-          <w:rFonts w:ascii="Liberation Sans" w:hAnsi="Liberation Sans"/>
-        </w:rPr>
+        <w:rPr/>
       </w:pPr>
       <w:r>
         <w:rPr>
@@ -1221,9 +1153,7 @@
         <w:pStyle w:val="Style18"/>
         <w:bidi w:val="0"/>
         <w:jc w:val="left"/>
-        <w:rPr>
-          <w:rFonts w:ascii="Liberation Sans" w:hAnsi="Liberation Sans"/>
-        </w:rPr>
+        <w:rPr/>
       </w:pPr>
       <w:r>
         <w:rPr>
@@ -1308,9 +1238,7 @@
               <w:pStyle w:val="Normal"/>
               <w:widowControl w:val="false"/>
               <w:spacing w:lineRule="auto" w:line="240"/>
-              <w:rPr>
-                <w:rFonts w:ascii="Liberation Sans" w:hAnsi="Liberation Sans"/>
-              </w:rPr>
+              <w:rPr/>
             </w:pPr>
             <w:r>
               <w:t>ИП Петров Петр Петрович, ИНН 000000000000, БИК 044525225, р/с 40702810000000000001, к/с 30101810400000000225, г. Москва, ул. Ленина, 1</w:t>
@@ -1398,80 +1326,10 @@
               <w:pStyle w:val="Style22"/>
               <w:widowControl w:val="false"/>
               <w:jc w:val="left"/>
-              <w:rPr>
-                <w:rFonts w:ascii="Liberation Sans" w:hAnsi="Liberation Sans"/>
-              </w:rPr>
+              <w:rPr/>
             </w:pPr>
             <w:r>
               <w:t>ООО Ромашка, ИНН 7701234567, +7 812 000 00 00, Банк клиента, г. Москва, ул. Ленина, 1</w:t>
-            </w:r>
-          </w:p>
-        </w:tc>
-      </w:tr>
-      <w:tr>
-        <w:trPr/>
-        <w:tc>
-          <w:tcPr>
-            <w:tcW w:w="5494" w:type="dxa"/>
-            <w:tcBorders/>
-            <w:tcMar>
-              <w:left w:w="0" w:type="dxa"/>
-              <w:right w:w="0" w:type="dxa"/>
-            </w:tcMar>
-          </w:tcPr>
-          <w:p>
-            <w:pPr>
-              <w:pStyle w:val="Style18"/>
-              <w:widowControl w:val="false"/>
-              <w:bidi w:val="0"/>
-              <w:snapToGrid w:val="false"/>
-              <w:jc w:val="left"/>
-              <w:rPr>
-                <w:rFonts w:ascii="Liberation Sans" w:hAnsi="Liberation Sans" w:cs="Arial"/>
-                <w:b/>
-                <w:sz w:val="16"/>
-                <w:szCs w:val="16"/>
-              </w:rPr>
-            </w:pPr>
-            <w:r>
-              <w:rPr>
-                <w:rFonts w:cs="Arial" w:ascii="Liberation Sans" w:hAnsi="Liberation Sans"/>
-                <w:b/>
-                <w:sz w:val="16"/>
-                <w:szCs w:val="16"/>
-              </w:rPr>
-            </w:r>
-          </w:p>
-        </w:tc>
-        <w:tc>
-          <w:tcPr>
-            <w:tcW w:w="5493" w:type="dxa"/>
-            <w:tcBorders/>
-            <w:tcMar>
-              <w:left w:w="0" w:type="dxa"/>
-              <w:right w:w="0" w:type="dxa"/>
-            </w:tcMar>
-          </w:tcPr>
-          <w:p>
-            <w:pPr>
-              <w:pStyle w:val="Normal"/>
-              <w:widowControl w:val="false"/>
-              <w:snapToGrid w:val="false"/>
-              <w:spacing w:before="0" w:after="200"/>
-              <w:rPr>
-                <w:rFonts w:ascii="Liberation Sans" w:hAnsi="Liberation Sans" w:cs="Arial"/>
-                <w:b/>
-                <w:sz w:val="20"/>
-                <w:szCs w:val="20"/>
-              </w:rPr>
-            </w:pPr>
-            <w:r>
-              <w:rPr>
-                <w:rFonts w:cs="Arial" w:ascii="Liberation Sans" w:hAnsi="Liberation Sans"/>
-                <w:b/>
-                <w:sz w:val="20"/>
-                <w:szCs w:val="20"/>
-              </w:rPr>
             </w:r>
           </w:p>
         </w:tc>
@@ -1482,72 +1340,8 @@
         <w:pStyle w:val="Style18"/>
         <w:bidi w:val="0"/>
         <w:jc w:val="left"/>
-        <w:rPr>
-          <w:rFonts w:ascii="Liberation Sans" w:hAnsi="Liberation Sans"/>
-        </w:rPr>
+        <w:rPr/>
       </w:pPr>
-      <w:r>
-        <mc:AlternateContent>
-          <mc:Choice Requires="wps">
-            <w:drawing>
-              <wp:anchor behindDoc="1" distT="5080" distB="5080" distL="5715" distR="4445" simplePos="0" locked="0" layoutInCell="1" allowOverlap="1" relativeHeight="2">
-                <wp:simplePos x="0" y="0"/>
-                <wp:positionH relativeFrom="column">
-                  <wp:posOffset>316230</wp:posOffset>
-                </wp:positionH>
-                <wp:positionV relativeFrom="paragraph">
-                  <wp:posOffset>115570</wp:posOffset>
-                </wp:positionV>
-                <wp:extent cx="6263005" cy="233680"/>
-                <wp:effectExtent l="5715" t="5080" r="4445" b="5080"/>
-                <wp:wrapNone/>
-                <wp:docPr id="1" name="Изображение1"/>
-                <a:graphic xmlns:a="http://schemas.openxmlformats.org/drawingml/2006/main">
-                  <a:graphicData uri="http://schemas.microsoft.com/office/word/2010/wordprocessingShape">
-                    <wps:wsp>
-                      <wps:cNvSpPr/>
-                      <wps:spPr>
-                        <a:xfrm>
-                          <a:off x="0" y="0"/>
-                          <a:ext cx="6262920" cy="233640"/>
-                        </a:xfrm>
-                        <a:prstGeom prst="rect">
-                          <a:avLst/>
-                        </a:prstGeom>
-                        <a:solidFill>
-                          <a:srgbClr val="ffffff"/>
-                        </a:solidFill>
-                        <a:ln cap="sq" w="9360">
-                          <a:solidFill>
-                            <a:srgbClr val="ffffff"/>
-                          </a:solidFill>
-                          <a:miter/>
-                        </a:ln>
-                      </wps:spPr>
-                      <wps:style>
-                        <a:lnRef idx="0"/>
-                        <a:fillRef idx="0"/>
-                        <a:effectRef idx="0"/>
-                        <a:fontRef idx="minor"/>
-                      </wps:style>
-                      <wps:bodyPr/>
-                    </wps:wsp>
-                  </a:graphicData>
-                </a:graphic>
-              </wp:anchor>
-            </w:drawing>
-          </mc:Choice>
-          <mc:Fallback>
-            <w:pict>
-              <v:rect id="shape_0" ID="Изображение1" path="m0,0l-2147483645,0l-2147483645,-2147483646l0,-2147483646xe" fillcolor="white" stroked="t" o:allowincell="f" style="position:absolute;margin-left:24.9pt;margin-top:9.1pt;width:493.1pt;height:18.35pt;mso-wrap-style:none;v-text-anchor:middle">
-                <v:fill o:detectmouseclick="t" type="solid" color2="black"/>
-                <v:stroke color="white" weight="9360" joinstyle="miter" endcap="square"/>
-                <w10:wrap type="none"/>
-              </v:rect>
-            </w:pict>
-          </mc:Fallback>
-        </mc:AlternateContent>
-      </w:r>
       <w:r>
         <w:rPr>
           <w:rFonts w:cs="Arial" w:ascii="Liberation Sans" w:hAnsi="Liberation Sans"/>
@@ -1562,273 +1356,430 @@
         <w:tab/>
       </w:r>
     </w:p>
+    <w:tbl>
+      <w:tblPr>
+        <w:tblW w:w="5000" w:type="pct"/>
+        <w:jc w:val="left"/>
+        <w:tblInd w:w="55" w:type="dxa"/>
+        <w:tblLayout w:type="fixed"/>
+        <w:tblCellMar>
+          <w:top w:w="55" w:type="dxa"/>
+          <w:left w:w="55" w:type="dxa"/>
+          <w:bottom w:w="55" w:type="dxa"/>
+          <w:right w:w="55" w:type="dxa"/>
+        </w:tblCellMar>
+      </w:tblPr>
+      <w:tblGrid>
+        <w:gridCol w:w="2306"/>
+        <w:gridCol w:w="544"/>
+        <w:gridCol w:w="1706"/>
+        <w:gridCol w:w="843"/>
+        <w:gridCol w:w="2344"/>
+        <w:gridCol w:w="591"/>
+        <w:gridCol w:w="1622"/>
+        <w:gridCol w:w="815"/>
+      </w:tblGrid>
+      <w:tr>
+        <w:trPr/>
+        <w:tc>
+          <w:tcPr>
+            <w:tcW w:w="4556" w:type="dxa"/>
+            <w:gridSpan w:val="3"/>
+            <w:tcBorders/>
+          </w:tcPr>
+          <w:p>
+            <w:pPr>
+              <w:pStyle w:val="Normal"/>
+              <w:spacing w:before="0" w:after="0"/>
+              <w:ind w:hanging="0" w:left="0" w:right="0"/>
+              <w:jc w:val="center"/>
+              <w:rPr/>
+            </w:pPr>
+            <w:r>
+              <w:rPr>
+                <w:rFonts w:cs="Arial" w:ascii="Liberation Sans" w:hAnsi="Liberation Sans"/>
+                <w:sz w:val="20"/>
+                <w:szCs w:val="20"/>
+              </w:rPr>
+              <w:t>ИСПОЛНИТЕЛЬ:</w:t>
+            </w:r>
+          </w:p>
+        </w:tc>
+        <w:tc>
+          <w:tcPr>
+            <w:tcW w:w="843" w:type="dxa"/>
+            <w:tcBorders/>
+          </w:tcPr>
+          <w:p>
+            <w:pPr>
+              <w:pStyle w:val="Normal"/>
+              <w:spacing w:before="0" w:after="0"/>
+              <w:ind w:hanging="0" w:left="0" w:right="0"/>
+              <w:rPr/>
+            </w:pPr>
+            <w:r>
+              <w:rPr/>
+            </w:r>
+          </w:p>
+        </w:tc>
+        <w:tc>
+          <w:tcPr>
+            <w:tcW w:w="4557" w:type="dxa"/>
+            <w:gridSpan w:val="3"/>
+            <w:tcBorders/>
+          </w:tcPr>
+          <w:p>
+            <w:pPr>
+              <w:pStyle w:val="Normal"/>
+              <w:spacing w:before="0" w:after="0"/>
+              <w:ind w:hanging="0" w:left="0" w:right="0"/>
+              <w:jc w:val="center"/>
+              <w:rPr/>
+            </w:pPr>
+            <w:r>
+              <w:rPr>
+                <w:rFonts w:cs="Arial" w:ascii="Liberation Sans" w:hAnsi="Liberation Sans"/>
+                <w:sz w:val="20"/>
+                <w:szCs w:val="20"/>
+              </w:rPr>
+              <w:t>ЗАКАЗЧИК:</w:t>
+            </w:r>
+          </w:p>
+        </w:tc>
+        <w:tc>
+          <w:tcPr>
+            <w:tcW w:w="815" w:type="dxa"/>
+            <w:tcBorders/>
+          </w:tcPr>
+          <w:p>
+            <w:pPr>
+              <w:pStyle w:val="Normal"/>
+              <w:spacing w:before="0" w:after="0"/>
+              <w:ind w:hanging="0" w:left="0" w:right="0"/>
+              <w:rPr/>
+            </w:pPr>
+            <w:r>
+              <w:rPr/>
+            </w:r>
+          </w:p>
+        </w:tc>
+      </w:tr>
+      <w:tr>
+        <w:trPr/>
+        <w:tc>
+          <w:tcPr>
+            <w:tcW w:w="2306" w:type="dxa"/>
+            <w:tcBorders/>
+          </w:tcPr>
+          <w:p>
+            <w:pPr>
+              <w:pStyle w:val="Normal"/>
+              <w:spacing w:before="0" w:after="0"/>
+              <w:jc w:val="right"/>
+              <w:rPr/>
+            </w:pPr>
+            <w:r>
+              <w:rPr>
+                <w:rFonts w:cs="Arial" w:ascii="Liberation Sans" w:hAnsi="Liberation Sans"/>
+                <w:b w:val="false"/>
+                <w:bCs w:val="false"/>
+                <w:sz w:val="20"/>
+                <w:szCs w:val="20"/>
+                <w:u w:val="none"/>
+                <w:lang w:val="en-US"/>
+              </w:rPr>
+              <w:t>__________________</w:t>
+            </w:r>
+            <w:r>
+              <w:rPr>
+                <w:rFonts w:cs="Arial" w:ascii="Liberation Sans" w:hAnsi="Liberation Sans"/>
+                <w:b w:val="false"/>
+                <w:bCs w:val="false"/>
+                <w:sz w:val="20"/>
+                <w:szCs w:val="20"/>
+                <w:u w:val="none"/>
+              </w:rPr>
+              <w:t xml:space="preserve"> </w:t>
+            </w:r>
+            <w:r>
+              <w:rPr>
+                <w:rFonts w:cs="Arial" w:ascii="Liberation Sans" w:hAnsi="Liberation Sans"/>
+                <w:b/>
+                <w:sz w:val="20"/>
+                <w:szCs w:val="20"/>
+                <w:u w:val="none"/>
+              </w:rPr>
+              <w:t>/</w:t>
+            </w:r>
+          </w:p>
+        </w:tc>
+        <w:tc>
+          <w:tcPr>
+            <w:tcW w:w="3093" w:type="dxa"/>
+            <w:gridSpan w:val="3"/>
+            <w:tcBorders/>
+          </w:tcPr>
+          <w:p>
+            <w:pPr>
+              <w:pStyle w:val="Normal"/>
+              <w:spacing w:before="0" w:after="0"/>
+              <w:rPr/>
+            </w:pPr>
+            <w:r>
+              <w:rPr>
+                <w:rFonts w:cs="Arial" w:ascii="Liberation Sans" w:hAnsi="Liberation Sans"/>
+                <w:b w:val="false"/>
+                <w:bCs w:val="false"/>
+                <w:sz w:val="20"/>
+                <w:szCs w:val="20"/>
+                <w:u w:val="none"/>
+                <w:lang w:val="en-US"/>
+              </w:rPr>
+              <w:t xml:space="preserve">__________________ </w:t>
+            </w:r>
+            <w:r>
+              <w:rPr>
+                <w:rFonts w:cs="Arial" w:ascii="Liberation Sans" w:hAnsi="Liberation Sans"/>
+                <w:b/>
+                <w:sz w:val="20"/>
+                <w:szCs w:val="20"/>
+                <w:u w:val="none"/>
+              </w:rPr>
+              <w:t>/</w:t>
+            </w:r>
+          </w:p>
+        </w:tc>
+        <w:tc>
+          <w:tcPr>
+            <w:tcW w:w="2344" w:type="dxa"/>
+            <w:tcBorders/>
+          </w:tcPr>
+          <w:p>
+            <w:pPr>
+              <w:pStyle w:val="Normal"/>
+              <w:spacing w:before="0" w:after="0"/>
+              <w:jc w:val="right"/>
+              <w:rPr/>
+            </w:pPr>
+            <w:r>
+              <w:rPr>
+                <w:rFonts w:cs="Arial" w:ascii="Liberation Sans" w:hAnsi="Liberation Sans"/>
+                <w:b w:val="false"/>
+                <w:bCs w:val="false"/>
+                <w:sz w:val="20"/>
+                <w:szCs w:val="20"/>
+                <w:u w:val="none"/>
+                <w:lang w:val="en-US"/>
+              </w:rPr>
+              <w:t>__________________</w:t>
+            </w:r>
+            <w:r>
+              <w:rPr>
+                <w:rFonts w:cs="Arial" w:ascii="Liberation Sans" w:hAnsi="Liberation Sans"/>
+                <w:b w:val="false"/>
+                <w:bCs w:val="false"/>
+                <w:sz w:val="20"/>
+                <w:szCs w:val="20"/>
+                <w:u w:val="none"/>
+              </w:rPr>
+              <w:t xml:space="preserve"> </w:t>
+            </w:r>
+            <w:r>
+              <w:rPr>
+                <w:rFonts w:cs="Arial" w:ascii="Liberation Sans" w:hAnsi="Liberation Sans"/>
+                <w:b/>
+                <w:sz w:val="20"/>
+                <w:szCs w:val="20"/>
+                <w:u w:val="none"/>
+              </w:rPr>
+              <w:t>/</w:t>
+            </w:r>
+          </w:p>
+        </w:tc>
+        <w:tc>
+          <w:tcPr>
+            <w:tcW w:w="3028" w:type="dxa"/>
+            <w:gridSpan w:val="3"/>
+            <w:tcBorders/>
+          </w:tcPr>
+          <w:p>
+            <w:pPr>
+              <w:pStyle w:val="Normal"/>
+              <w:spacing w:before="0" w:after="0"/>
+              <w:rPr/>
+            </w:pPr>
+            <w:r>
+              <w:rPr>
+                <w:rFonts w:cs="Arial" w:ascii="Liberation Sans" w:hAnsi="Liberation Sans"/>
+                <w:b w:val="false"/>
+                <w:bCs w:val="false"/>
+                <w:sz w:val="20"/>
+                <w:szCs w:val="20"/>
+                <w:u w:val="none"/>
+                <w:lang w:val="en-US"/>
+              </w:rPr>
+              <w:t xml:space="preserve">__________________ </w:t>
+            </w:r>
+            <w:r>
+              <w:rPr>
+                <w:rFonts w:cs="Arial" w:ascii="Liberation Sans" w:hAnsi="Liberation Sans"/>
+                <w:b/>
+                <w:sz w:val="20"/>
+                <w:szCs w:val="20"/>
+                <w:u w:val="none"/>
+              </w:rPr>
+              <w:t>/</w:t>
+            </w:r>
+          </w:p>
+        </w:tc>
+      </w:tr>
+      <w:tr>
+        <w:trPr/>
+        <w:tc>
+          <w:tcPr>
+            <w:tcW w:w="2306" w:type="dxa"/>
+            <w:tcBorders/>
+          </w:tcPr>
+          <w:p>
+            <w:pPr>
+              <w:pStyle w:val="Normal"/>
+              <w:spacing w:before="0" w:after="200"/>
+              <w:rPr>
+                <w:rFonts w:ascii="Liberation Sans" w:hAnsi="Liberation Sans" w:cs="Arial"/>
+                <w:b/>
+                <w:sz w:val="20"/>
+                <w:szCs w:val="20"/>
+                <w:u w:val="none"/>
+              </w:rPr>
+            </w:pPr>
+            <w:r>
+              <w:rPr/>
+            </w:r>
+          </w:p>
+        </w:tc>
+        <w:tc>
+          <w:tcPr>
+            <w:tcW w:w="544" w:type="dxa"/>
+            <w:tcBorders/>
+          </w:tcPr>
+          <w:p>
+            <w:pPr>
+              <w:pStyle w:val="Normal"/>
+              <w:spacing w:before="0" w:after="200"/>
+              <w:rPr>
+                <w:rFonts w:ascii="Liberation Sans" w:hAnsi="Liberation Sans" w:cs="Arial"/>
+                <w:sz w:val="20"/>
+                <w:szCs w:val="20"/>
+              </w:rPr>
+            </w:pPr>
+            <w:r>
+              <w:rPr>
+                <w:rFonts w:cs="Arial" w:ascii="Liberation Sans" w:hAnsi="Liberation Sans"/>
+                <w:sz w:val="20"/>
+                <w:szCs w:val="20"/>
+              </w:rPr>
+            </w:r>
+          </w:p>
+        </w:tc>
+        <w:tc>
+          <w:tcPr>
+            <w:tcW w:w="2549" w:type="dxa"/>
+            <w:gridSpan w:val="2"/>
+            <w:tcBorders/>
+          </w:tcPr>
+          <w:p>
+            <w:pPr>
+              <w:pStyle w:val="Normal"/>
+              <w:spacing w:before="0" w:after="200"/>
+              <w:rPr>
+                <w:rFonts w:ascii="Liberation Sans" w:hAnsi="Liberation Sans" w:cs="Arial"/>
+                <w:sz w:val="20"/>
+                <w:szCs w:val="20"/>
+              </w:rPr>
+            </w:pPr>
+            <w:r>
+              <w:rPr>
+                <w:rFonts w:cs="Arial" w:ascii="Liberation Sans" w:hAnsi="Liberation Sans"/>
+                <w:sz w:val="20"/>
+                <w:szCs w:val="20"/>
+              </w:rPr>
+              <w:t>М.П.</w:t>
+            </w:r>
+          </w:p>
+        </w:tc>
+        <w:tc>
+          <w:tcPr>
+            <w:tcW w:w="2344" w:type="dxa"/>
+            <w:tcBorders/>
+          </w:tcPr>
+          <w:p>
+            <w:pPr>
+              <w:pStyle w:val="Normal"/>
+              <w:spacing w:before="0" w:after="200"/>
+              <w:rPr>
+                <w:rFonts w:ascii="Liberation Sans" w:hAnsi="Liberation Sans" w:cs="Arial"/>
+                <w:b/>
+                <w:sz w:val="20"/>
+                <w:szCs w:val="20"/>
+              </w:rPr>
+            </w:pPr>
+            <w:r>
+              <w:rPr>
+                <w:rFonts w:cs="Arial" w:ascii="Liberation Sans" w:hAnsi="Liberation Sans"/>
+                <w:b/>
+                <w:sz w:val="20"/>
+                <w:szCs w:val="20"/>
+              </w:rPr>
+            </w:r>
+          </w:p>
+        </w:tc>
+        <w:tc>
+          <w:tcPr>
+            <w:tcW w:w="591" w:type="dxa"/>
+            <w:tcBorders/>
+          </w:tcPr>
+          <w:p>
+            <w:pPr>
+              <w:pStyle w:val="Normal"/>
+              <w:spacing w:before="0" w:after="200"/>
+              <w:rPr>
+                <w:u w:val="none"/>
+              </w:rPr>
+            </w:pPr>
+            <w:r>
+              <w:rPr>
+                <w:u w:val="none"/>
+              </w:rPr>
+            </w:r>
+          </w:p>
+        </w:tc>
+        <w:tc>
+          <w:tcPr>
+            <w:tcW w:w="2437" w:type="dxa"/>
+            <w:gridSpan w:val="2"/>
+            <w:tcBorders/>
+          </w:tcPr>
+          <w:p>
+            <w:pPr>
+              <w:pStyle w:val="Normal"/>
+              <w:spacing w:before="0" w:after="200"/>
+              <w:rPr/>
+            </w:pPr>
+            <w:r>
+              <w:rPr/>
+              <w:t>М.П.</w:t>
+            </w:r>
+          </w:p>
+        </w:tc>
+      </w:tr>
+    </w:tbl>
     <w:p>
       <w:pPr>
         <w:pStyle w:val="Normal"/>
-        <w:spacing w:before="0" w:after="0"/>
-        <w:ind w:firstLine="708" w:left="0" w:right="0"/>
-        <w:rPr>
-          <w:rFonts w:ascii="Liberation Sans" w:hAnsi="Liberation Sans"/>
-        </w:rPr>
-      </w:pPr>
-      <w:r>
-        <w:rPr>
-          <w:rFonts w:cs="Arial" w:ascii="Liberation Sans" w:hAnsi="Liberation Sans"/>
-          <w:sz w:val="20"/>
-          <w:szCs w:val="20"/>
-        </w:rPr>
-        <w:t>ИСПОЛНИТЕЛЬ:</w:t>
-        <w:tab/>
-        <w:tab/>
-        <w:tab/>
-        <w:tab/>
-        <w:tab/>
-        <w:tab/>
-        <w:tab/>
-        <w:t>ЗАКАЗЧИК:</w:t>
-      </w:r>
-    </w:p>
-    <w:p>
-      <w:pPr>
-        <w:pStyle w:val="Normal"/>
-        <w:spacing w:before="0" w:after="0"/>
-        <w:rPr>
-          <w:rFonts w:ascii="Liberation Sans" w:hAnsi="Liberation Sans"/>
-        </w:rPr>
-      </w:pPr>
-      <w:r>
-        <mc:AlternateContent>
-          <mc:Choice Requires="wps">
-            <w:drawing>
-              <wp:anchor behindDoc="0" distT="5715" distB="4445" distL="5715" distR="4445" simplePos="0" locked="0" layoutInCell="1" allowOverlap="1" relativeHeight="3">
-                <wp:simplePos x="0" y="0"/>
-                <wp:positionH relativeFrom="column">
-                  <wp:posOffset>40005</wp:posOffset>
-                </wp:positionH>
-                <wp:positionV relativeFrom="paragraph">
-                  <wp:posOffset>1400810</wp:posOffset>
-                </wp:positionV>
-                <wp:extent cx="6739255" cy="281305"/>
-                <wp:effectExtent l="5715" t="5715" r="4445" b="4445"/>
-                <wp:wrapNone/>
-                <wp:docPr id="2" name="Изображение2"/>
-                <a:graphic xmlns:a="http://schemas.openxmlformats.org/drawingml/2006/main">
-                  <a:graphicData uri="http://schemas.microsoft.com/office/word/2010/wordprocessingShape">
-                    <wps:wsp>
-                      <wps:cNvSpPr/>
-                      <wps:spPr>
-                        <a:xfrm>
-                          <a:off x="0" y="0"/>
-                          <a:ext cx="6739200" cy="281160"/>
-                        </a:xfrm>
-                        <a:prstGeom prst="rect">
-                          <a:avLst/>
-                        </a:prstGeom>
-                        <a:solidFill>
-                          <a:srgbClr val="ffffff"/>
-                        </a:solidFill>
-                        <a:ln cap="sq" w="9360">
-                          <a:solidFill>
-                            <a:srgbClr val="ffffff"/>
-                          </a:solidFill>
-                          <a:miter/>
-                        </a:ln>
-                      </wps:spPr>
-                      <wps:style>
-                        <a:lnRef idx="0"/>
-                        <a:fillRef idx="0"/>
-                        <a:effectRef idx="0"/>
-                        <a:fontRef idx="minor"/>
-                      </wps:style>
-                      <wps:bodyPr/>
-                    </wps:wsp>
-                  </a:graphicData>
-                </a:graphic>
-              </wp:anchor>
-            </w:drawing>
-          </mc:Choice>
-          <mc:Fallback>
-            <w:pict>
-              <v:rect id="shape_0" ID="Изображение2" path="m0,0l-2147483645,0l-2147483645,-2147483646l0,-2147483646xe" fillcolor="white" stroked="t" o:allowincell="f" style="position:absolute;margin-left:3.15pt;margin-top:110.3pt;width:530.6pt;height:22.1pt;mso-wrap-style:none;v-text-anchor:middle">
-                <v:fill o:detectmouseclick="t" type="solid" color2="black"/>
-                <v:stroke color="white" weight="9360" joinstyle="miter" endcap="square"/>
-                <w10:wrap type="none"/>
-              </v:rect>
-            </w:pict>
-          </mc:Fallback>
-        </mc:AlternateContent>
-        <mc:AlternateContent>
-          <mc:Choice Requires="wps">
-            <w:drawing>
-              <wp:anchor behindDoc="0" distT="5080" distB="5080" distL="5715" distR="4445" simplePos="0" locked="0" layoutInCell="1" allowOverlap="1" relativeHeight="4">
-                <wp:simplePos x="0" y="0"/>
-                <wp:positionH relativeFrom="column">
-                  <wp:posOffset>144780</wp:posOffset>
-                </wp:positionH>
-                <wp:positionV relativeFrom="paragraph">
-                  <wp:posOffset>636270</wp:posOffset>
-                </wp:positionV>
-                <wp:extent cx="6853555" cy="405130"/>
-                <wp:effectExtent l="5715" t="5080" r="4445" b="5080"/>
-                <wp:wrapNone/>
-                <wp:docPr id="3" name="Изображение3"/>
-                <a:graphic xmlns:a="http://schemas.openxmlformats.org/drawingml/2006/main">
-                  <a:graphicData uri="http://schemas.microsoft.com/office/word/2010/wordprocessingShape">
-                    <wps:wsp>
-                      <wps:cNvSpPr/>
-                      <wps:spPr>
-                        <a:xfrm>
-                          <a:off x="0" y="0"/>
-                          <a:ext cx="6853680" cy="405000"/>
-                        </a:xfrm>
-                        <a:prstGeom prst="rect">
-                          <a:avLst/>
-                        </a:prstGeom>
-                        <a:solidFill>
-                          <a:srgbClr val="ffffff"/>
-                        </a:solidFill>
-                        <a:ln cap="sq" w="9360">
-                          <a:solidFill>
-                            <a:srgbClr val="ffffff"/>
-                          </a:solidFill>
-                          <a:miter/>
-                        </a:ln>
-                      </wps:spPr>
-                      <wps:style>
-                        <a:lnRef idx="0"/>
-                        <a:fillRef idx="0"/>
-                        <a:effectRef idx="0"/>
-                        <a:fontRef idx="minor"/>
-                      </wps:style>
-                      <wps:bodyPr/>
-                    </wps:wsp>
-                  </a:graphicData>
-                </a:graphic>
-              </wp:anchor>
-            </w:drawing>
-          </mc:Choice>
-          <mc:Fallback>
-            <w:pict>
-              <v:rect id="shape_0" ID="Изображение3" path="m0,0l-2147483645,0l-2147483645,-2147483646l0,-2147483646xe" fillcolor="white" stroked="t" o:allowincell="f" style="position:absolute;margin-left:11.4pt;margin-top:50.1pt;width:539.6pt;height:31.85pt;mso-wrap-style:none;v-text-anchor:middle">
-                <v:fill o:detectmouseclick="t" type="solid" color2="black"/>
-                <v:stroke color="white" weight="9360" joinstyle="miter" endcap="square"/>
-                <w10:wrap type="none"/>
-              </v:rect>
-            </w:pict>
-          </mc:Fallback>
-        </mc:AlternateContent>
-      </w:r>
-      <w:r>
-        <w:rPr>
-          <w:rFonts w:cs="Arial" w:ascii="Liberation Sans" w:hAnsi="Liberation Sans"/>
-          <w:b/>
-          <w:sz w:val="20"/>
-          <w:szCs w:val="20"/>
-          <w:u w:val="single"/>
-        </w:rPr>
-        <w:tab/>
-        <w:tab/>
-        <w:tab/>
-      </w:r>
-      <w:r>
-        <w:rPr>
-          <w:rFonts w:cs="Arial" w:ascii="Liberation Sans" w:hAnsi="Liberation Sans"/>
-          <w:b/>
-          <w:sz w:val="20"/>
-          <w:szCs w:val="20"/>
-        </w:rPr>
-        <w:t xml:space="preserve"> </w:t>
-      </w:r>
-      <w:r>
-        <w:rPr>
-          <w:rFonts w:cs="Arial" w:ascii="Liberation Sans" w:hAnsi="Liberation Sans"/>
-          <w:b/>
-          <w:sz w:val="20"/>
-          <w:szCs w:val="20"/>
-          <w:u w:val="single"/>
-        </w:rPr>
-        <w:t>/                                /</w:t>
-      </w:r>
-      <w:r>
-        <w:rPr>
-          <w:rFonts w:cs="Arial" w:ascii="Liberation Sans" w:hAnsi="Liberation Sans"/>
-          <w:b/>
-          <w:sz w:val="20"/>
-          <w:szCs w:val="20"/>
-        </w:rPr>
-        <w:tab/>
-        <w:tab/>
-        <w:t xml:space="preserve">           </w:t>
-        <w:tab/>
-        <w:tab/>
-        <w:t xml:space="preserve">    </w:t>
-      </w:r>
-      <w:r>
-        <w:rPr>
-          <w:rFonts w:cs="Arial" w:ascii="Liberation Sans" w:hAnsi="Liberation Sans"/>
-          <w:b/>
-          <w:sz w:val="20"/>
-          <w:szCs w:val="20"/>
-          <w:u w:val="single"/>
-        </w:rPr>
-        <w:tab/>
-        <w:tab/>
-        <w:tab/>
-      </w:r>
-      <w:r>
-        <w:rPr>
-          <w:rFonts w:cs="Arial" w:ascii="Liberation Sans" w:hAnsi="Liberation Sans"/>
-          <w:b/>
-          <w:sz w:val="20"/>
-          <w:szCs w:val="20"/>
-        </w:rPr>
-        <w:t xml:space="preserve"> </w:t>
-      </w:r>
-      <w:r>
-        <w:rPr>
-          <w:rFonts w:cs="Arial" w:ascii="Liberation Sans" w:hAnsi="Liberation Sans"/>
-          <w:b/>
-          <w:sz w:val="20"/>
-          <w:szCs w:val="20"/>
-          <w:u w:val="single"/>
-        </w:rPr>
-        <w:t>/                                /</w:t>
-      </w:r>
-      <w:r>
-        <w:rPr>
-          <w:rFonts w:cs="Arial" w:ascii="Liberation Sans" w:hAnsi="Liberation Sans"/>
-          <w:b/>
-          <w:sz w:val="20"/>
-          <w:szCs w:val="20"/>
-        </w:rPr>
-        <w:tab/>
-      </w:r>
-      <w:r>
-        <w:rPr>
-          <w:rFonts w:cs="Arial" w:ascii="Liberation Sans" w:hAnsi="Liberation Sans"/>
-          <w:sz w:val="20"/>
-          <w:szCs w:val="20"/>
-        </w:rPr>
-        <w:tab/>
-        <w:tab/>
-        <w:t xml:space="preserve">        М.П.</w:t>
-        <w:tab/>
-        <w:tab/>
-        <w:tab/>
-        <w:tab/>
-        <w:tab/>
-        <w:tab/>
-        <w:tab/>
-        <w:tab/>
-        <w:t xml:space="preserve">        М.П.</w:t>
-        <w:tab/>
-        <w:tab/>
-      </w:r>
-    </w:p>
-    <w:p>
-      <w:pPr>
-        <w:pStyle w:val="Normal"/>
-        <w:spacing w:before="0" w:after="0"/>
+        <w:widowControl/>
+        <w:bidi w:val="0"/>
+        <w:spacing w:lineRule="auto" w:line="276" w:before="0" w:after="0"/>
+        <w:jc w:val="left"/>
         <w:rPr>
           <w:rFonts w:ascii="Liberation Sans" w:hAnsi="Liberation Sans" w:cs="Arial"/>
           <w:sz w:val="20"/>
@@ -2134,6 +2085,29 @@
       <w:rFonts w:ascii="Arial" w:hAnsi="Arial" w:eastAsia="Courier New" w:cs="Courier New"/>
       <w:sz w:val="20"/>
       <w:szCs w:val="20"/>
+    </w:rPr>
+  </w:style>
+  <w:style w:type="paragraph" w:styleId="TableContents">
+    <w:name w:val="Table Contents"/>
+    <w:basedOn w:val="Normal"/>
+    <w:qFormat/>
+    <w:pPr>
+      <w:widowControl w:val="false"/>
+      <w:suppressLineNumbers/>
+    </w:pPr>
+    <w:rPr/>
+  </w:style>
+  <w:style w:type="paragraph" w:styleId="TableHeading">
+    <w:name w:val="Table Heading"/>
+    <w:basedOn w:val="TableContents"/>
+    <w:qFormat/>
+    <w:pPr>
+      <w:suppressLineNumbers/>
+      <w:jc w:val="center"/>
+    </w:pPr>
+    <w:rPr>
+      <w:b/>
+      <w:bCs/>
     </w:rPr>
   </w:style>
 </w:styles>

</xml_diff>

<commit_message>
test(golden-docs): refresh DOCX fixtures after template layout edits
Regenerated from DocumentFixtureGenerator after contract application table and waybill entrepreneur wrap changes.
</commit_message>
<xml_diff>
--- a/backend/src/test/resources/golden-docs/contract_application_sample.docx
+++ b/backend/src/test/resources/golden-docs/contract_application_sample.docx
@@ -1207,32 +1207,14 @@
         <w:gridCol w:w="5493"/>
       </w:tblGrid>
       <w:tr>
-        <w:trPr/>
+        <w:trPr>
+          <w:trHeight w:val="4256" w:hRule="atLeast"/>
+        </w:trPr>
         <w:tc>
           <w:tcPr>
             <w:tcW w:w="5494" w:type="dxa"/>
             <w:tcBorders/>
           </w:tcPr>
-          <w:p>
-            <w:pPr>
-              <w:pStyle w:val="Normal"/>
-              <w:widowControl w:val="false"/>
-              <w:snapToGrid w:val="false"/>
-              <w:spacing w:lineRule="auto" w:line="240"/>
-              <w:rPr>
-                <w:rFonts w:ascii="Liberation Sans" w:hAnsi="Liberation Sans" w:cs="Times New Roman"/>
-                <w:b/>
-                <w:bCs/>
-              </w:rPr>
-            </w:pPr>
-            <w:r>
-              <w:rPr>
-                <w:rFonts w:cs="Times New Roman" w:ascii="Liberation Sans" w:hAnsi="Liberation Sans"/>
-                <w:b/>
-                <w:bCs/>
-              </w:rPr>
-            </w:r>
-          </w:p>
           <w:p>
             <w:pPr>
               <w:pStyle w:val="Normal"/>
@@ -1298,29 +1280,6 @@
             <w:tcW w:w="5493" w:type="dxa"/>
             <w:tcBorders/>
           </w:tcPr>
-          <w:p>
-            <w:pPr>
-              <w:pStyle w:val="Normal"/>
-              <w:widowControl w:val="false"/>
-              <w:snapToGrid w:val="false"/>
-              <w:rPr>
-                <w:rFonts w:ascii="Liberation Sans" w:hAnsi="Liberation Sans" w:cs="Times New Roman"/>
-                <w:b/>
-                <w:color w:val="000000"/>
-                <w:sz w:val="20"/>
-                <w:szCs w:val="20"/>
-              </w:rPr>
-            </w:pPr>
-            <w:r>
-              <w:rPr>
-                <w:rFonts w:cs="Times New Roman" w:ascii="Liberation Sans" w:hAnsi="Liberation Sans"/>
-                <w:b/>
-                <w:color w:val="000000"/>
-                <w:sz w:val="20"/>
-                <w:szCs w:val="20"/>
-              </w:rPr>
-            </w:r>
-          </w:p>
           <w:p>
             <w:pPr>
               <w:pStyle w:val="Style22"/>
@@ -1653,7 +1612,13 @@
               </w:rPr>
             </w:pPr>
             <w:r>
-              <w:rPr/>
+              <w:rPr>
+                <w:rFonts w:cs="Arial" w:ascii="Liberation Sans" w:hAnsi="Liberation Sans"/>
+                <w:b/>
+                <w:sz w:val="20"/>
+                <w:szCs w:val="20"/>
+                <w:u w:val="none"/>
+              </w:rPr>
             </w:r>
           </w:p>
         </w:tc>

</xml_diff>